<commit_message>
Finalize paper formatting: IEEE US Letter two-column layout, author placeholders, availability statement
Fixes single-column/A4 layout to standard IEEE two-column US Letter, marks
author/affiliation fields clearly as unfilled, and adds an accurate code/data
availability note (the repo's benchmark has since grown past what this
paper's Sec. VI results describe).
</commit_message>
<xml_diff>
--- a/ECERAG_Conference_Paper_REVISED.docx
+++ b/ECERAG_Conference_Paper_REVISED.docx
@@ -25,8 +25,9 @@
         <w:rPr>
           <w:rFonts w:ascii="Times New Roman" w:hAnsi="Times New Roman"/>
           <w:b/>
-        </w:rPr>
-        <w:t>Author Name, Author Name, Author Name</w:t>
+          <w:i w:val="0"/>
+        </w:rPr>
+        <w:t>[AUTHOR NAME(S) -- TO BE FILLED IN BEFORE SUBMISSION]</w:t>
       </w:r>
     </w:p>
     <w:p>
@@ -36,28 +37,14 @@
       <w:r>
         <w:rPr>
           <w:rFonts w:ascii="Times New Roman" w:hAnsi="Times New Roman"/>
-          <w:i/>
-          <w:sz w:val="20"/>
-        </w:rPr>
-        <w:t>Department / Institution / University</w:t>
-      </w:r>
-      <w:r>
-        <w:rPr>
-          <w:rFonts w:ascii="Times New Roman" w:hAnsi="Times New Roman"/>
-          <w:i/>
-          <w:sz w:val="20"/>
-        </w:rPr>
+          <w:b w:val="0"/>
+          <w:i w:val="0"/>
+        </w:rPr>
+        <w:t>[DEPARTMENT / INSTITUTION -- TO BE FILLED IN]</w:t>
         <w:br/>
-        <w:t>City, Country</w:t>
-      </w:r>
-      <w:r>
-        <w:rPr>
-          <w:rFonts w:ascii="Times New Roman" w:hAnsi="Times New Roman"/>
-          <w:i/>
-          <w:sz w:val="20"/>
-        </w:rPr>
+        <w:t>[CITY, COUNTRY -- TO BE FILLED IN]</w:t>
         <w:br/>
-        <w:t>email@domain.com</w:t>
+        <w:t>[EMAIL -- TO BE FILLED IN]</w:t>
       </w:r>
     </w:p>
     <w:p>
@@ -1463,6 +1450,18 @@
     </w:p>
     <w:p>
       <w:pPr>
+        <w:jc w:val="both"/>
+      </w:pPr>
+      <w:r>
+        <w:rPr>
+          <w:rFonts w:ascii="Times New Roman" w:hAnsi="Times New Roman"/>
+          <w:i/>
+        </w:rPr>
+        <w:t>Code and Data Availability: The ECERAG pipeline implementation, corpus sources, and benchmark are available at https://github.com/yomisys/LLM. Note that the repository reflects ongoing work: its benchmark has since been expanded from the 40 items evaluated in this paper to 60, and its generator/grading code has been revised accordingly; results in Sec. VI correspond to the earlier 40-item configuration described in Sec. V-A, not necessarily to the repository's current default configuration.</w:t>
+      </w:r>
+    </w:p>
+    <w:p>
+      <w:pPr>
         <w:pBdr>
           <w:bottom w:val="single" w:sz="6" w:space="1" w:color="000000"/>
         </w:pBdr>
@@ -1736,10 +1735,10 @@
       </w:r>
     </w:p>
     <w:sectPr>
-      <w:pgSz w:w="11906" w:h="16838"/>
-      <w:pgMar w:top="1417" w:right="1417" w:bottom="1417" w:left="1417" w:header="720" w:footer="720" w:gutter="0"/>
-      <w:cols w:space="720"/>
+      <w:pgSz w:w="12240" w:h="15840"/>
+      <w:pgMar w:top="1080" w:right="900" w:bottom="1440" w:left="900" w:header="720" w:footer="720" w:gutter="0"/>
       <w:docGrid w:linePitch="360"/>
+      <w:cols w:num="2" w:space="288"/>
     </w:sectPr>
   </w:body>
 </w:document>

</xml_diff>